<commit_message>
Added the regression notebook
</commit_message>
<xml_diff>
--- a/Theoretical Research/3-4 Wek TabPFN Research (Theory).docx
+++ b/Theoretical Research/3-4 Wek TabPFN Research (Theory).docx
@@ -207,7 +207,7 @@
           <w:bCs/>
         </w:rPr>
         <w:pict w14:anchorId="577422CF">
-          <v:rect id="_x0000_i1049" style="width:0;height:1.5pt" o:hralign="center" o:hrstd="t" o:hr="t" fillcolor="#a0a0a0" stroked="f"/>
+          <v:rect id="_x0000_i1025" style="width:0;height:1.5pt" o:hralign="center" o:hrstd="t" o:hr="t" fillcolor="#a0a0a0" stroked="f"/>
         </w:pict>
       </w:r>
     </w:p>
@@ -492,7 +492,7 @@
           <w:bCs/>
         </w:rPr>
         <w:pict w14:anchorId="1D683871">
-          <v:rect id="_x0000_i1050" style="width:0;height:1.5pt" o:hralign="center" o:hrstd="t" o:hr="t" fillcolor="#a0a0a0" stroked="f"/>
+          <v:rect id="_x0000_i1026" style="width:0;height:1.5pt" o:hralign="center" o:hrstd="t" o:hr="t" fillcolor="#a0a0a0" stroked="f"/>
         </w:pict>
       </w:r>
     </w:p>
@@ -628,7 +628,7 @@
           <w:bCs/>
         </w:rPr>
         <w:pict w14:anchorId="424A0757">
-          <v:rect id="_x0000_i1051" style="width:0;height:1.5pt" o:hralign="center" o:hrstd="t" o:hr="t" fillcolor="#a0a0a0" stroked="f"/>
+          <v:rect id="_x0000_i1027" style="width:0;height:1.5pt" o:hralign="center" o:hrstd="t" o:hr="t" fillcolor="#a0a0a0" stroked="f"/>
         </w:pict>
       </w:r>
     </w:p>
@@ -956,15 +956,13 @@
                 <w:bCs/>
               </w:rPr>
             </w:pPr>
-            <w:proofErr w:type="spellStart"/>
             <w:r>
               <w:rPr>
                 <w:b/>
                 <w:bCs/>
               </w:rPr>
-              <w:t>Modeled</w:t>
+              <w:t>Modelled</w:t>
             </w:r>
-            <w:proofErr w:type="spellEnd"/>
             <w:r>
               <w:rPr>
                 <w:b/>
@@ -1087,7 +1085,7 @@
           <w:bCs/>
         </w:rPr>
         <w:pict w14:anchorId="2D08689A">
-          <v:rect id="_x0000_i1052" style="width:0;height:1.5pt" o:hralign="center" o:hrstd="t" o:hr="t" fillcolor="#a0a0a0" stroked="f"/>
+          <v:rect id="_x0000_i1028" style="width:0;height:1.5pt" o:hralign="center" o:hrstd="t" o:hr="t" fillcolor="#a0a0a0" stroked="f"/>
         </w:pict>
       </w:r>
     </w:p>
@@ -1113,30 +1111,1233 @@
         </w:rPr>
         <w:t xml:space="preserve"> Why </w:t>
       </w:r>
+      <w:r>
+        <w:rPr>
+          <w:b/>
+          <w:bCs/>
+        </w:rPr>
+        <w:t>these matters</w:t>
+      </w:r>
+    </w:p>
+    <w:p>
+      <w:pPr>
+        <w:rPr>
+          <w:b/>
+          <w:bCs/>
+        </w:rPr>
+      </w:pPr>
+      <w:r>
+        <w:rPr>
+          <w:b/>
+          <w:bCs/>
+        </w:rPr>
+        <w:t>TabPFN's strength comes from learning a generic, Bayesian-inspired learning algorithm thanks to exposure to a massive and diverse synthetic data universe. This gives it robustness to real-world dataset idiosyncrasies—without needing dataset-specific tuning.</w:t>
+      </w:r>
+    </w:p>
+    <w:p>
+      <w:pPr>
+        <w:rPr>
+          <w:b/>
+          <w:bCs/>
+        </w:rPr>
+      </w:pPr>
+    </w:p>
+    <w:p>
+      <w:pPr>
+        <w:rPr>
+          <w:b/>
+          <w:bCs/>
+        </w:rPr>
+      </w:pPr>
+      <w:r>
+        <w:rPr>
+          <w:b/>
+          <w:bCs/>
+        </w:rPr>
+        <w:t>Here’s what I found:</w:t>
+      </w:r>
+    </w:p>
+    <w:p>
+      <w:pPr>
+        <w:rPr>
+          <w:b/>
+          <w:bCs/>
+        </w:rPr>
+      </w:pPr>
+      <w:r>
+        <w:rPr>
+          <w:b/>
+          <w:bCs/>
+        </w:rPr>
+        <w:pict w14:anchorId="20F624B5">
+          <v:rect id="_x0000_i1029" style="width:0;height:1.5pt" o:hralign="center" o:hrstd="t" o:hr="t" fillcolor="#a0a0a0" stroked="f"/>
+        </w:pict>
+      </w:r>
+    </w:p>
+    <w:p>
+      <w:pPr>
+        <w:rPr>
+          <w:b/>
+          <w:bCs/>
+        </w:rPr>
+      </w:pPr>
+      <w:r>
+        <w:rPr>
+          <w:rFonts w:ascii="Segoe UI Emoji" w:hAnsi="Segoe UI Emoji" w:cs="Segoe UI Emoji"/>
+          <w:b/>
+          <w:bCs/>
+        </w:rPr>
+        <w:t>🧩</w:t>
+      </w:r>
+      <w:r>
+        <w:rPr>
+          <w:b/>
+          <w:bCs/>
+        </w:rPr>
+        <w:t xml:space="preserve"> Is the synthetic data generation code publicly available?</w:t>
+      </w:r>
+    </w:p>
+    <w:p>
+      <w:pPr>
+        <w:rPr>
+          <w:b/>
+          <w:bCs/>
+        </w:rPr>
+      </w:pPr>
+      <w:r>
+        <w:rPr>
+          <w:b/>
+          <w:bCs/>
+        </w:rPr>
+        <w:t>While the TabPFN GitHub repository and related projects are publicly accessible, the actual code used to generate the ~130 million synthetic training datasets is not included. As noted by the authors:</w:t>
+      </w:r>
+    </w:p>
+    <w:p>
+      <w:pPr>
+        <w:rPr>
+          <w:b/>
+          <w:bCs/>
+        </w:rPr>
+      </w:pPr>
+      <w:r>
+        <w:rPr>
+          <w:b/>
+          <w:bCs/>
+        </w:rPr>
+        <w:t>“The code to run inference is available, just not the training code and data generation.” (</w:t>
+      </w:r>
+      <w:hyperlink r:id="rId16" w:tooltip="TabPFN v2 – A SOTA foundation model for small tabular data" w:history="1">
+        <w:r>
+          <w:rPr>
+            <w:rStyle w:val="Hyperlink"/>
+            <w:b/>
+            <w:bCs/>
+          </w:rPr>
+          <w:t>news.ycombinator.com</w:t>
+        </w:r>
+      </w:hyperlink>
+      <w:r>
+        <w:rPr>
+          <w:b/>
+          <w:bCs/>
+        </w:rPr>
+        <w:t>)</w:t>
+      </w:r>
+    </w:p>
+    <w:p>
+      <w:pPr>
+        <w:rPr>
+          <w:b/>
+          <w:bCs/>
+        </w:rPr>
+      </w:pPr>
+      <w:r>
+        <w:rPr>
+          <w:b/>
+          <w:bCs/>
+        </w:rPr>
+        <w:t>In other words, the model and inference tools are open-source, but the training data script—the generator used to create the synthetic SCM/BNN datasets—is not released.</w:t>
+      </w:r>
+    </w:p>
+    <w:p>
+      <w:pPr>
+        <w:rPr>
+          <w:b/>
+          <w:bCs/>
+        </w:rPr>
+      </w:pPr>
+      <w:r>
+        <w:rPr>
+          <w:b/>
+          <w:bCs/>
+        </w:rPr>
+        <w:pict w14:anchorId="1DEAFCF6">
+          <v:rect id="_x0000_i1030" style="width:0;height:1.5pt" o:hralign="center" o:hrstd="t" o:hr="t" fillcolor="#a0a0a0" stroked="f"/>
+        </w:pict>
+      </w:r>
+    </w:p>
+    <w:p>
+      <w:pPr>
+        <w:rPr>
+          <w:b/>
+          <w:bCs/>
+        </w:rPr>
+      </w:pPr>
+      <w:r>
+        <w:rPr>
+          <w:rFonts w:ascii="Segoe UI Emoji" w:hAnsi="Segoe UI Emoji" w:cs="Segoe UI Emoji"/>
+          <w:b/>
+          <w:bCs/>
+        </w:rPr>
+        <w:t>🔍</w:t>
+      </w:r>
+      <w:r>
+        <w:rPr>
+          <w:b/>
+          <w:bCs/>
+        </w:rPr>
+        <w:t xml:space="preserve"> Implications for your analysis</w:t>
+      </w:r>
+    </w:p>
+    <w:p>
+      <w:pPr>
+        <w:rPr>
+          <w:b/>
+          <w:bCs/>
+        </w:rPr>
+      </w:pPr>
+      <w:r>
+        <w:rPr>
+          <w:b/>
+          <w:bCs/>
+        </w:rPr>
+        <w:t xml:space="preserve">Since the generation code is not available, we cannot inspect exact implementation details or run tools like Gemini 2.5 on that code—there is nothing to ingest or </w:t>
+      </w:r>
+      <w:proofErr w:type="spellStart"/>
+      <w:r>
+        <w:rPr>
+          <w:b/>
+          <w:bCs/>
+        </w:rPr>
+        <w:t>analyze</w:t>
+      </w:r>
+      <w:proofErr w:type="spellEnd"/>
+      <w:r>
+        <w:rPr>
+          <w:b/>
+          <w:bCs/>
+        </w:rPr>
+        <w:t xml:space="preserve"> for verification. Therefore:</w:t>
+      </w:r>
+    </w:p>
+    <w:p>
+      <w:pPr>
+        <w:numPr>
+          <w:ilvl w:val="0"/>
+          <w:numId w:val="4"/>
+        </w:numPr>
+        <w:rPr>
+          <w:b/>
+          <w:bCs/>
+        </w:rPr>
+      </w:pPr>
+      <w:r>
+        <w:rPr>
+          <w:b/>
+          <w:bCs/>
+        </w:rPr>
+        <w:t>My prior answers (based on the paper and supplementary) remain accurate.</w:t>
+      </w:r>
+    </w:p>
+    <w:p>
+      <w:pPr>
+        <w:numPr>
+          <w:ilvl w:val="0"/>
+          <w:numId w:val="4"/>
+        </w:numPr>
+        <w:rPr>
+          <w:b/>
+          <w:bCs/>
+        </w:rPr>
+      </w:pPr>
+      <w:r>
+        <w:rPr>
+          <w:b/>
+          <w:bCs/>
+        </w:rPr>
+        <w:t>No code-level clarifications exist (e.g., precise distributions, parameter settings) beyond what is described in the paper.</w:t>
+      </w:r>
+    </w:p>
+    <w:p>
+      <w:pPr>
+        <w:numPr>
+          <w:ilvl w:val="0"/>
+          <w:numId w:val="4"/>
+        </w:numPr>
+        <w:rPr>
+          <w:b/>
+          <w:bCs/>
+        </w:rPr>
+      </w:pPr>
+      <w:r>
+        <w:rPr>
+          <w:b/>
+          <w:bCs/>
+        </w:rPr>
+        <w:lastRenderedPageBreak/>
+        <w:t xml:space="preserve">Any deeper confirmation of assumptions or edge-case </w:t>
+      </w:r>
+      <w:proofErr w:type="spellStart"/>
+      <w:r>
+        <w:rPr>
+          <w:b/>
+          <w:bCs/>
+        </w:rPr>
+        <w:t>behavior</w:t>
+      </w:r>
+      <w:proofErr w:type="spellEnd"/>
+      <w:r>
+        <w:rPr>
+          <w:b/>
+          <w:bCs/>
+        </w:rPr>
+        <w:t xml:space="preserve"> inside the synthetic data generator is impossible without access to the code.</w:t>
+      </w:r>
+    </w:p>
+    <w:p>
+      <w:pPr>
+        <w:rPr>
+          <w:b/>
+          <w:bCs/>
+        </w:rPr>
+      </w:pPr>
+      <w:r>
+        <w:rPr>
+          <w:b/>
+          <w:bCs/>
+        </w:rPr>
+        <w:pict w14:anchorId="5AF72E9A">
+          <v:rect id="_x0000_i1031" style="width:0;height:1.5pt" o:hralign="center" o:hrstd="t" o:hr="t" fillcolor="#a0a0a0" stroked="f"/>
+        </w:pict>
+      </w:r>
+    </w:p>
+    <w:p>
+      <w:pPr>
+        <w:rPr>
+          <w:b/>
+          <w:bCs/>
+        </w:rPr>
+      </w:pPr>
+      <w:r>
+        <w:rPr>
+          <w:rFonts w:ascii="Segoe UI Emoji" w:hAnsi="Segoe UI Emoji" w:cs="Segoe UI Emoji"/>
+          <w:b/>
+          <w:bCs/>
+        </w:rPr>
+        <w:t>✅</w:t>
+      </w:r>
+      <w:r>
+        <w:rPr>
+          <w:b/>
+          <w:bCs/>
+        </w:rPr>
+        <w:t xml:space="preserve"> Summary</w:t>
+      </w:r>
+    </w:p>
+    <w:p>
+      <w:pPr>
+        <w:numPr>
+          <w:ilvl w:val="0"/>
+          <w:numId w:val="5"/>
+        </w:numPr>
+        <w:rPr>
+          <w:b/>
+          <w:bCs/>
+        </w:rPr>
+      </w:pPr>
+      <w:r>
+        <w:rPr>
+          <w:b/>
+          <w:bCs/>
+        </w:rPr>
+        <w:t>The public TabPFN code includes model inference, but not synthetic-data generation.</w:t>
+      </w:r>
+    </w:p>
+    <w:p>
+      <w:pPr>
+        <w:numPr>
+          <w:ilvl w:val="0"/>
+          <w:numId w:val="5"/>
+        </w:numPr>
+        <w:rPr>
+          <w:b/>
+          <w:bCs/>
+        </w:rPr>
+      </w:pPr>
+      <w:r>
+        <w:rPr>
+          <w:b/>
+          <w:bCs/>
+        </w:rPr>
+        <w:t>Training generation scripts are closed—likely proprietary.</w:t>
+      </w:r>
+    </w:p>
+    <w:p>
+      <w:pPr>
+        <w:numPr>
+          <w:ilvl w:val="0"/>
+          <w:numId w:val="5"/>
+        </w:numPr>
+        <w:rPr>
+          <w:b/>
+          <w:bCs/>
+        </w:rPr>
+      </w:pPr>
+      <w:r>
+        <w:rPr>
+          <w:b/>
+          <w:bCs/>
+        </w:rPr>
+        <w:t>Without that code, we can't reconfirm details via inspection or external tools.</w:t>
+      </w:r>
+    </w:p>
+    <w:p>
+      <w:pPr>
+        <w:rPr>
+          <w:b/>
+          <w:bCs/>
+        </w:rPr>
+      </w:pPr>
+      <w:r>
+        <w:rPr>
+          <w:b/>
+          <w:bCs/>
+        </w:rPr>
+        <w:t xml:space="preserve">Let me know if you'd like guidance on possible workarounds, or deeper dives based on the </w:t>
+      </w:r>
       <w:proofErr w:type="gramStart"/>
       <w:r>
         <w:rPr>
           <w:b/>
           <w:bCs/>
         </w:rPr>
-        <w:t>this matters</w:t>
+        <w:t>paper’s</w:t>
       </w:r>
       <w:proofErr w:type="gramEnd"/>
-    </w:p>
-    <w:p>
-      <w:pPr>
-        <w:rPr>
-          <w:b/>
-          <w:bCs/>
-        </w:rPr>
-      </w:pPr>
-      <w:r>
-        <w:rPr>
-          <w:b/>
-          <w:bCs/>
-        </w:rPr>
-        <w:t>TabPFN's strength comes from learning a generic, Bayesian-inspired learning algorithm thanks to exposure to a massive and diverse synthetic data universe. This gives it robustness to real-world dataset idiosyncrasies—without needing dataset-specific tuning.</w:t>
-      </w:r>
+      <w:r>
+        <w:rPr>
+          <w:b/>
+          <w:bCs/>
+        </w:rPr>
+        <w:t xml:space="preserve"> supplementary!</w:t>
+      </w:r>
+    </w:p>
+    <w:p>
+      <w:pPr>
+        <w:rPr>
+          <w:b/>
+          <w:bCs/>
+        </w:rPr>
+      </w:pPr>
+    </w:p>
+    <w:p>
+      <w:pPr>
+        <w:rPr>
+          <w:b/>
+          <w:bCs/>
+        </w:rPr>
+      </w:pPr>
+      <w:r>
+        <w:rPr>
+          <w:b/>
+          <w:bCs/>
+        </w:rPr>
+        <w:t xml:space="preserve">No, TabPFN does </w:t>
+      </w:r>
+      <w:r>
+        <w:rPr>
+          <w:b/>
+          <w:bCs/>
+          <w:i/>
+          <w:iCs/>
+        </w:rPr>
+        <w:t>not</w:t>
+      </w:r>
+      <w:r>
+        <w:rPr>
+          <w:b/>
+          <w:bCs/>
+        </w:rPr>
+        <w:t xml:space="preserve"> create synthetic data during training on your small or medium dataset.</w:t>
+      </w:r>
+    </w:p>
+    <w:p>
+      <w:pPr>
+        <w:rPr>
+          <w:b/>
+          <w:bCs/>
+        </w:rPr>
+      </w:pPr>
+      <w:r>
+        <w:rPr>
+          <w:b/>
+          <w:bCs/>
+        </w:rPr>
+        <w:pict w14:anchorId="685A7882">
+          <v:rect id="_x0000_i1056" style="width:0;height:1.5pt" o:hralign="center" o:hrstd="t" o:hr="t" fillcolor="#a0a0a0" stroked="f"/>
+        </w:pict>
+      </w:r>
+    </w:p>
+    <w:p>
+      <w:pPr>
+        <w:rPr>
+          <w:b/>
+          <w:bCs/>
+        </w:rPr>
+      </w:pPr>
+      <w:r>
+        <w:rPr>
+          <w:rFonts w:ascii="Segoe UI Emoji" w:hAnsi="Segoe UI Emoji" w:cs="Segoe UI Emoji"/>
+          <w:b/>
+          <w:bCs/>
+        </w:rPr>
+        <w:t>🔍</w:t>
+      </w:r>
+      <w:r>
+        <w:rPr>
+          <w:b/>
+          <w:bCs/>
+        </w:rPr>
+        <w:t xml:space="preserve"> Here's the full explanation:</w:t>
+      </w:r>
+    </w:p>
+    <w:p>
+      <w:pPr>
+        <w:rPr>
+          <w:b/>
+          <w:bCs/>
+        </w:rPr>
+      </w:pPr>
+      <w:r>
+        <w:rPr>
+          <w:rFonts w:ascii="Segoe UI Emoji" w:hAnsi="Segoe UI Emoji" w:cs="Segoe UI Emoji"/>
+          <w:b/>
+          <w:bCs/>
+        </w:rPr>
+        <w:t>✅</w:t>
+      </w:r>
+      <w:r>
+        <w:rPr>
+          <w:b/>
+          <w:bCs/>
+        </w:rPr>
+        <w:t xml:space="preserve"> Pretraining Phase (Before You Use It)</w:t>
+      </w:r>
+    </w:p>
+    <w:p>
+      <w:pPr>
+        <w:numPr>
+          <w:ilvl w:val="0"/>
+          <w:numId w:val="6"/>
+        </w:numPr>
+        <w:rPr>
+          <w:b/>
+          <w:bCs/>
+        </w:rPr>
+      </w:pPr>
+      <w:r>
+        <w:rPr>
+          <w:b/>
+          <w:bCs/>
+        </w:rPr>
+        <w:t>TabPFN is pretrained on 130 million synthetic datasets.</w:t>
+      </w:r>
+    </w:p>
+    <w:p>
+      <w:pPr>
+        <w:numPr>
+          <w:ilvl w:val="0"/>
+          <w:numId w:val="6"/>
+        </w:numPr>
+        <w:rPr>
+          <w:b/>
+          <w:bCs/>
+        </w:rPr>
+      </w:pPr>
+      <w:r>
+        <w:rPr>
+          <w:b/>
+          <w:bCs/>
+        </w:rPr>
+        <w:t>These are generated once, using Structural Causal Models (SCMs) and Bayesian Neural Networks (BNNs).</w:t>
+      </w:r>
+    </w:p>
+    <w:p>
+      <w:pPr>
+        <w:numPr>
+          <w:ilvl w:val="0"/>
+          <w:numId w:val="6"/>
+        </w:numPr>
+        <w:rPr>
+          <w:b/>
+          <w:bCs/>
+        </w:rPr>
+      </w:pPr>
+      <w:r>
+        <w:rPr>
+          <w:b/>
+          <w:bCs/>
+        </w:rPr>
+        <w:t xml:space="preserve">This training teaches the model </w:t>
+      </w:r>
+      <w:r>
+        <w:rPr>
+          <w:b/>
+          <w:bCs/>
+          <w:i/>
+          <w:iCs/>
+        </w:rPr>
+        <w:t>how to learn from small datasets</w:t>
+      </w:r>
+      <w:r>
+        <w:rPr>
+          <w:b/>
+          <w:bCs/>
+        </w:rPr>
+        <w:t>.</w:t>
+      </w:r>
+    </w:p>
+    <w:p>
+      <w:pPr>
+        <w:rPr>
+          <w:b/>
+          <w:bCs/>
+        </w:rPr>
+      </w:pPr>
+      <w:r>
+        <w:rPr>
+          <w:rFonts w:ascii="Segoe UI Emoji" w:hAnsi="Segoe UI Emoji" w:cs="Segoe UI Emoji"/>
+          <w:b/>
+          <w:bCs/>
+        </w:rPr>
+        <w:t>🔧</w:t>
+      </w:r>
+      <w:r>
+        <w:rPr>
+          <w:b/>
+          <w:bCs/>
+        </w:rPr>
+        <w:t xml:space="preserve"> This happens offline — you don’t see this or need to do anything.</w:t>
+      </w:r>
+    </w:p>
+    <w:p>
+      <w:pPr>
+        <w:rPr>
+          <w:b/>
+          <w:bCs/>
+        </w:rPr>
+      </w:pPr>
+      <w:r>
+        <w:rPr>
+          <w:b/>
+          <w:bCs/>
+        </w:rPr>
+        <w:pict w14:anchorId="71CE0AE2">
+          <v:rect id="_x0000_i1057" style="width:0;height:1.5pt" o:hralign="center" o:hrstd="t" o:hr="t" fillcolor="#a0a0a0" stroked="f"/>
+        </w:pict>
+      </w:r>
+    </w:p>
+    <w:p>
+      <w:pPr>
+        <w:rPr>
+          <w:b/>
+          <w:bCs/>
+        </w:rPr>
+      </w:pPr>
+      <w:r>
+        <w:rPr>
+          <w:rFonts w:ascii="Segoe UI Emoji" w:hAnsi="Segoe UI Emoji" w:cs="Segoe UI Emoji"/>
+          <w:b/>
+          <w:bCs/>
+        </w:rPr>
+        <w:t>🚫</w:t>
+      </w:r>
+      <w:r>
+        <w:rPr>
+          <w:b/>
+          <w:bCs/>
+        </w:rPr>
+        <w:t xml:space="preserve"> What </w:t>
+      </w:r>
+      <w:r>
+        <w:rPr>
+          <w:b/>
+          <w:bCs/>
+          <w:i/>
+          <w:iCs/>
+        </w:rPr>
+        <w:t>doesn't</w:t>
+      </w:r>
+      <w:r>
+        <w:rPr>
+          <w:b/>
+          <w:bCs/>
+        </w:rPr>
+        <w:t xml:space="preserve"> happen</w:t>
+      </w:r>
+    </w:p>
+    <w:p>
+      <w:pPr>
+        <w:rPr>
+          <w:b/>
+          <w:bCs/>
+        </w:rPr>
+      </w:pPr>
+      <w:r>
+        <w:rPr>
+          <w:b/>
+          <w:bCs/>
+        </w:rPr>
+        <w:t>When you give TabPFN your small or medium-sized dataset:</w:t>
+      </w:r>
+    </w:p>
+    <w:p>
+      <w:pPr>
+        <w:numPr>
+          <w:ilvl w:val="0"/>
+          <w:numId w:val="7"/>
+        </w:numPr>
+        <w:rPr>
+          <w:b/>
+          <w:bCs/>
+        </w:rPr>
+      </w:pPr>
+      <w:r>
+        <w:rPr>
+          <w:b/>
+          <w:bCs/>
+        </w:rPr>
+        <w:t>It does not generate synthetic data.</w:t>
+      </w:r>
+    </w:p>
+    <w:p>
+      <w:pPr>
+        <w:numPr>
+          <w:ilvl w:val="0"/>
+          <w:numId w:val="7"/>
+        </w:numPr>
+        <w:rPr>
+          <w:b/>
+          <w:bCs/>
+        </w:rPr>
+      </w:pPr>
+      <w:r>
+        <w:rPr>
+          <w:b/>
+          <w:bCs/>
+        </w:rPr>
+        <w:t>It does not perform any fine-tuning.</w:t>
+      </w:r>
+    </w:p>
+    <w:p>
+      <w:pPr>
+        <w:numPr>
+          <w:ilvl w:val="0"/>
+          <w:numId w:val="7"/>
+        </w:numPr>
+        <w:rPr>
+          <w:b/>
+          <w:bCs/>
+        </w:rPr>
+      </w:pPr>
+      <w:r>
+        <w:rPr>
+          <w:b/>
+          <w:bCs/>
+        </w:rPr>
+        <w:t>It does not do any retraining or gradient descent.</w:t>
+      </w:r>
+    </w:p>
+    <w:p>
+      <w:pPr>
+        <w:rPr>
+          <w:b/>
+          <w:bCs/>
+        </w:rPr>
+      </w:pPr>
+      <w:r>
+        <w:rPr>
+          <w:b/>
+          <w:bCs/>
+        </w:rPr>
+        <w:pict w14:anchorId="08848361">
+          <v:rect id="_x0000_i1058" style="width:0;height:1.5pt" o:hralign="center" o:hrstd="t" o:hr="t" fillcolor="#a0a0a0" stroked="f"/>
+        </w:pict>
+      </w:r>
+    </w:p>
+    <w:p>
+      <w:pPr>
+        <w:rPr>
+          <w:b/>
+          <w:bCs/>
+        </w:rPr>
+      </w:pPr>
+      <w:r>
+        <w:rPr>
+          <w:rFonts w:ascii="Segoe UI Emoji" w:hAnsi="Segoe UI Emoji" w:cs="Segoe UI Emoji"/>
+          <w:b/>
+          <w:bCs/>
+        </w:rPr>
+        <w:t>🧠</w:t>
+      </w:r>
+      <w:r>
+        <w:rPr>
+          <w:b/>
+          <w:bCs/>
+        </w:rPr>
+        <w:t xml:space="preserve"> What it </w:t>
+      </w:r>
+      <w:r>
+        <w:rPr>
+          <w:b/>
+          <w:bCs/>
+          <w:i/>
+          <w:iCs/>
+        </w:rPr>
+        <w:t>does</w:t>
+      </w:r>
+      <w:r>
+        <w:rPr>
+          <w:b/>
+          <w:bCs/>
+        </w:rPr>
+        <w:t xml:space="preserve"> do instead</w:t>
+      </w:r>
+    </w:p>
+    <w:p>
+      <w:pPr>
+        <w:numPr>
+          <w:ilvl w:val="0"/>
+          <w:numId w:val="8"/>
+        </w:numPr>
+        <w:rPr>
+          <w:b/>
+          <w:bCs/>
+        </w:rPr>
+      </w:pPr>
+      <w:r>
+        <w:rPr>
+          <w:b/>
+          <w:bCs/>
+        </w:rPr>
+        <w:t xml:space="preserve">TabPFN treats your dataset (few </w:t>
+      </w:r>
+      <w:proofErr w:type="spellStart"/>
+      <w:r>
+        <w:rPr>
+          <w:b/>
+          <w:bCs/>
+        </w:rPr>
+        <w:t>labeled</w:t>
+      </w:r>
+      <w:proofErr w:type="spellEnd"/>
+      <w:r>
+        <w:rPr>
+          <w:b/>
+          <w:bCs/>
+        </w:rPr>
+        <w:t xml:space="preserve"> + </w:t>
+      </w:r>
+      <w:proofErr w:type="spellStart"/>
+      <w:r>
+        <w:rPr>
+          <w:b/>
+          <w:bCs/>
+        </w:rPr>
+        <w:t>unlabeled</w:t>
+      </w:r>
+      <w:proofErr w:type="spellEnd"/>
+      <w:r>
+        <w:rPr>
+          <w:b/>
+          <w:bCs/>
+        </w:rPr>
+        <w:t xml:space="preserve"> samples) as a sequence.</w:t>
+      </w:r>
+    </w:p>
+    <w:p>
+      <w:pPr>
+        <w:numPr>
+          <w:ilvl w:val="0"/>
+          <w:numId w:val="8"/>
+        </w:numPr>
+        <w:rPr>
+          <w:b/>
+          <w:bCs/>
+        </w:rPr>
+      </w:pPr>
+      <w:r>
+        <w:rPr>
+          <w:b/>
+          <w:bCs/>
+        </w:rPr>
+        <w:t>It passes this sequence through the transformer in one forward pass.</w:t>
+      </w:r>
+    </w:p>
+    <w:p>
+      <w:pPr>
+        <w:numPr>
+          <w:ilvl w:val="0"/>
+          <w:numId w:val="8"/>
+        </w:numPr>
+        <w:rPr>
+          <w:b/>
+          <w:bCs/>
+        </w:rPr>
+      </w:pPr>
+      <w:r>
+        <w:rPr>
+          <w:b/>
+          <w:bCs/>
+        </w:rPr>
+        <w:t xml:space="preserve">It predicts the labels for the </w:t>
+      </w:r>
+      <w:proofErr w:type="spellStart"/>
+      <w:r>
+        <w:rPr>
+          <w:b/>
+          <w:bCs/>
+        </w:rPr>
+        <w:t>unlabeled</w:t>
+      </w:r>
+      <w:proofErr w:type="spellEnd"/>
+      <w:r>
+        <w:rPr>
+          <w:b/>
+          <w:bCs/>
+        </w:rPr>
+        <w:t xml:space="preserve"> (test) examples.</w:t>
+      </w:r>
+    </w:p>
+    <w:p>
+      <w:pPr>
+        <w:rPr>
+          <w:b/>
+          <w:bCs/>
+        </w:rPr>
+      </w:pPr>
+      <w:r>
+        <w:rPr>
+          <w:b/>
+          <w:bCs/>
+        </w:rPr>
+        <w:t>This is called in-context learning, and it's very fast.</w:t>
+      </w:r>
+    </w:p>
+    <w:p>
+      <w:pPr>
+        <w:rPr>
+          <w:b/>
+          <w:bCs/>
+        </w:rPr>
+      </w:pPr>
+      <w:r>
+        <w:rPr>
+          <w:b/>
+          <w:bCs/>
+        </w:rPr>
+        <w:pict w14:anchorId="5EB0DCB4">
+          <v:rect id="_x0000_i1059" style="width:0;height:1.5pt" o:hralign="center" o:hrstd="t" o:hr="t" fillcolor="#a0a0a0" stroked="f"/>
+        </w:pict>
+      </w:r>
+    </w:p>
+    <w:p>
+      <w:pPr>
+        <w:rPr>
+          <w:b/>
+          <w:bCs/>
+        </w:rPr>
+      </w:pPr>
+      <w:r>
+        <w:rPr>
+          <w:rFonts w:ascii="Segoe UI Emoji" w:hAnsi="Segoe UI Emoji" w:cs="Segoe UI Emoji"/>
+          <w:b/>
+          <w:bCs/>
+        </w:rPr>
+        <w:t>📌</w:t>
+      </w:r>
+      <w:r>
+        <w:rPr>
+          <w:b/>
+          <w:bCs/>
+        </w:rPr>
+        <w:t xml:space="preserve"> Summary Table</w:t>
+      </w:r>
+    </w:p>
+    <w:tbl>
+      <w:tblPr>
+        <w:tblW w:w="0" w:type="auto"/>
+        <w:tblCellSpacing w:w="15" w:type="dxa"/>
+        <w:tblCellMar>
+          <w:top w:w="15" w:type="dxa"/>
+          <w:left w:w="15" w:type="dxa"/>
+          <w:bottom w:w="15" w:type="dxa"/>
+          <w:right w:w="15" w:type="dxa"/>
+        </w:tblCellMar>
+        <w:tblLook w:val="04A0" w:firstRow="1" w:lastRow="0" w:firstColumn="1" w:lastColumn="0" w:noHBand="0" w:noVBand="1"/>
+      </w:tblPr>
+      <w:tblGrid>
+        <w:gridCol w:w="2452"/>
+        <w:gridCol w:w="3258"/>
+        <w:gridCol w:w="2913"/>
+      </w:tblGrid>
+      <w:tr>
+        <w:trPr>
+          <w:tblHeader/>
+          <w:tblCellSpacing w:w="15" w:type="dxa"/>
+        </w:trPr>
+        <w:tc>
+          <w:tcPr>
+            <w:tcW w:w="0" w:type="auto"/>
+            <w:vAlign w:val="center"/>
+            <w:hideMark/>
+          </w:tcPr>
+          <w:p>
+            <w:pPr>
+              <w:rPr>
+                <w:b/>
+                <w:bCs/>
+              </w:rPr>
+            </w:pPr>
+            <w:r>
+              <w:rPr>
+                <w:b/>
+                <w:bCs/>
+              </w:rPr>
+              <w:lastRenderedPageBreak/>
+              <w:t>Phase</w:t>
+            </w:r>
+          </w:p>
+        </w:tc>
+        <w:tc>
+          <w:tcPr>
+            <w:tcW w:w="0" w:type="auto"/>
+            <w:vAlign w:val="center"/>
+            <w:hideMark/>
+          </w:tcPr>
+          <w:p>
+            <w:pPr>
+              <w:rPr>
+                <w:b/>
+                <w:bCs/>
+              </w:rPr>
+            </w:pPr>
+            <w:r>
+              <w:rPr>
+                <w:b/>
+                <w:bCs/>
+              </w:rPr>
+              <w:t>Does it generate synthetic data?</w:t>
+            </w:r>
+          </w:p>
+        </w:tc>
+        <w:tc>
+          <w:tcPr>
+            <w:tcW w:w="0" w:type="auto"/>
+            <w:vAlign w:val="center"/>
+            <w:hideMark/>
+          </w:tcPr>
+          <w:p>
+            <w:pPr>
+              <w:rPr>
+                <w:b/>
+                <w:bCs/>
+              </w:rPr>
+            </w:pPr>
+            <w:r>
+              <w:rPr>
+                <w:b/>
+                <w:bCs/>
+              </w:rPr>
+              <w:t>Purpose</w:t>
+            </w:r>
+          </w:p>
+        </w:tc>
+      </w:tr>
+      <w:tr>
+        <w:trPr>
+          <w:tblCellSpacing w:w="15" w:type="dxa"/>
+        </w:trPr>
+        <w:tc>
+          <w:tcPr>
+            <w:tcW w:w="0" w:type="auto"/>
+            <w:vAlign w:val="center"/>
+            <w:hideMark/>
+          </w:tcPr>
+          <w:p>
+            <w:pPr>
+              <w:rPr>
+                <w:b/>
+                <w:bCs/>
+              </w:rPr>
+            </w:pPr>
+            <w:r>
+              <w:rPr>
+                <w:b/>
+                <w:bCs/>
+              </w:rPr>
+              <w:t>Pretraining (offline)</w:t>
+            </w:r>
+          </w:p>
+        </w:tc>
+        <w:tc>
+          <w:tcPr>
+            <w:tcW w:w="0" w:type="auto"/>
+            <w:vAlign w:val="center"/>
+            <w:hideMark/>
+          </w:tcPr>
+          <w:p>
+            <w:pPr>
+              <w:rPr>
+                <w:b/>
+                <w:bCs/>
+              </w:rPr>
+            </w:pPr>
+            <w:r>
+              <w:rPr>
+                <w:rFonts w:ascii="Segoe UI Emoji" w:hAnsi="Segoe UI Emoji" w:cs="Segoe UI Emoji"/>
+                <w:b/>
+                <w:bCs/>
+              </w:rPr>
+              <w:t>✅</w:t>
+            </w:r>
+            <w:r>
+              <w:rPr>
+                <w:b/>
+                <w:bCs/>
+              </w:rPr>
+              <w:t xml:space="preserve"> Yes</w:t>
+            </w:r>
+          </w:p>
+        </w:tc>
+        <w:tc>
+          <w:tcPr>
+            <w:tcW w:w="0" w:type="auto"/>
+            <w:vAlign w:val="center"/>
+            <w:hideMark/>
+          </w:tcPr>
+          <w:p>
+            <w:pPr>
+              <w:rPr>
+                <w:b/>
+                <w:bCs/>
+              </w:rPr>
+            </w:pPr>
+            <w:r>
+              <w:rPr>
+                <w:b/>
+                <w:bCs/>
+              </w:rPr>
+              <w:t>Teach TabPFN how to learn</w:t>
+            </w:r>
+          </w:p>
+        </w:tc>
+      </w:tr>
+      <w:tr>
+        <w:trPr>
+          <w:tblCellSpacing w:w="15" w:type="dxa"/>
+        </w:trPr>
+        <w:tc>
+          <w:tcPr>
+            <w:tcW w:w="0" w:type="auto"/>
+            <w:vAlign w:val="center"/>
+            <w:hideMark/>
+          </w:tcPr>
+          <w:p>
+            <w:pPr>
+              <w:rPr>
+                <w:b/>
+                <w:bCs/>
+              </w:rPr>
+            </w:pPr>
+            <w:r>
+              <w:rPr>
+                <w:b/>
+                <w:bCs/>
+              </w:rPr>
+              <w:t>Inference (your dataset)</w:t>
+            </w:r>
+          </w:p>
+        </w:tc>
+        <w:tc>
+          <w:tcPr>
+            <w:tcW w:w="0" w:type="auto"/>
+            <w:vAlign w:val="center"/>
+            <w:hideMark/>
+          </w:tcPr>
+          <w:p>
+            <w:pPr>
+              <w:rPr>
+                <w:b/>
+                <w:bCs/>
+              </w:rPr>
+            </w:pPr>
+            <w:r>
+              <w:rPr>
+                <w:rFonts w:ascii="Segoe UI Emoji" w:hAnsi="Segoe UI Emoji" w:cs="Segoe UI Emoji"/>
+                <w:b/>
+                <w:bCs/>
+              </w:rPr>
+              <w:t>❌</w:t>
+            </w:r>
+            <w:r>
+              <w:rPr>
+                <w:b/>
+                <w:bCs/>
+              </w:rPr>
+              <w:t xml:space="preserve"> No</w:t>
+            </w:r>
+          </w:p>
+        </w:tc>
+        <w:tc>
+          <w:tcPr>
+            <w:tcW w:w="0" w:type="auto"/>
+            <w:vAlign w:val="center"/>
+            <w:hideMark/>
+          </w:tcPr>
+          <w:p>
+            <w:pPr>
+              <w:rPr>
+                <w:b/>
+                <w:bCs/>
+              </w:rPr>
+            </w:pPr>
+            <w:r>
+              <w:rPr>
+                <w:b/>
+                <w:bCs/>
+              </w:rPr>
+              <w:t>Predict using what it learned</w:t>
+            </w:r>
+          </w:p>
+        </w:tc>
+      </w:tr>
+    </w:tbl>
+    <w:p>
+      <w:pPr>
+        <w:rPr>
+          <w:b/>
+          <w:bCs/>
+        </w:rPr>
+      </w:pPr>
+    </w:p>
+    <w:p>
+      <w:pPr>
+        <w:rPr>
+          <w:b/>
+          <w:bCs/>
+        </w:rPr>
+      </w:pPr>
     </w:p>
     <w:p>
       <w:pPr>
@@ -1308,6 +2509,453 @@
     </w:lvl>
   </w:abstractNum>
   <w:abstractNum w:abstractNumId="1" w15:restartNumberingAfterBreak="0">
+    <w:nsid w:val="1AC64812"/>
+    <w:multiLevelType w:val="multilevel"/>
+    <w:tmpl w:val="5CFA41D0"/>
+    <w:lvl w:ilvl="0">
+      <w:start w:val="1"/>
+      <w:numFmt w:val="bullet"/>
+      <w:lvlText w:val=""/>
+      <w:lvlJc w:val="left"/>
+      <w:pPr>
+        <w:tabs>
+          <w:tab w:val="num" w:pos="720"/>
+        </w:tabs>
+        <w:ind w:left="720" w:hanging="360"/>
+      </w:pPr>
+      <w:rPr>
+        <w:rFonts w:ascii="Symbol" w:hAnsi="Symbol" w:hint="default"/>
+        <w:sz w:val="20"/>
+      </w:rPr>
+    </w:lvl>
+    <w:lvl w:ilvl="1" w:tentative="1">
+      <w:start w:val="1"/>
+      <w:numFmt w:val="bullet"/>
+      <w:lvlText w:val="o"/>
+      <w:lvlJc w:val="left"/>
+      <w:pPr>
+        <w:tabs>
+          <w:tab w:val="num" w:pos="1440"/>
+        </w:tabs>
+        <w:ind w:left="1440" w:hanging="360"/>
+      </w:pPr>
+      <w:rPr>
+        <w:rFonts w:ascii="Courier New" w:hAnsi="Courier New" w:hint="default"/>
+        <w:sz w:val="20"/>
+      </w:rPr>
+    </w:lvl>
+    <w:lvl w:ilvl="2" w:tentative="1">
+      <w:start w:val="1"/>
+      <w:numFmt w:val="bullet"/>
+      <w:lvlText w:val=""/>
+      <w:lvlJc w:val="left"/>
+      <w:pPr>
+        <w:tabs>
+          <w:tab w:val="num" w:pos="2160"/>
+        </w:tabs>
+        <w:ind w:left="2160" w:hanging="360"/>
+      </w:pPr>
+      <w:rPr>
+        <w:rFonts w:ascii="Wingdings" w:hAnsi="Wingdings" w:hint="default"/>
+        <w:sz w:val="20"/>
+      </w:rPr>
+    </w:lvl>
+    <w:lvl w:ilvl="3" w:tentative="1">
+      <w:start w:val="1"/>
+      <w:numFmt w:val="bullet"/>
+      <w:lvlText w:val=""/>
+      <w:lvlJc w:val="left"/>
+      <w:pPr>
+        <w:tabs>
+          <w:tab w:val="num" w:pos="2880"/>
+        </w:tabs>
+        <w:ind w:left="2880" w:hanging="360"/>
+      </w:pPr>
+      <w:rPr>
+        <w:rFonts w:ascii="Wingdings" w:hAnsi="Wingdings" w:hint="default"/>
+        <w:sz w:val="20"/>
+      </w:rPr>
+    </w:lvl>
+    <w:lvl w:ilvl="4" w:tentative="1">
+      <w:start w:val="1"/>
+      <w:numFmt w:val="bullet"/>
+      <w:lvlText w:val=""/>
+      <w:lvlJc w:val="left"/>
+      <w:pPr>
+        <w:tabs>
+          <w:tab w:val="num" w:pos="3600"/>
+        </w:tabs>
+        <w:ind w:left="3600" w:hanging="360"/>
+      </w:pPr>
+      <w:rPr>
+        <w:rFonts w:ascii="Wingdings" w:hAnsi="Wingdings" w:hint="default"/>
+        <w:sz w:val="20"/>
+      </w:rPr>
+    </w:lvl>
+    <w:lvl w:ilvl="5" w:tentative="1">
+      <w:start w:val="1"/>
+      <w:numFmt w:val="bullet"/>
+      <w:lvlText w:val=""/>
+      <w:lvlJc w:val="left"/>
+      <w:pPr>
+        <w:tabs>
+          <w:tab w:val="num" w:pos="4320"/>
+        </w:tabs>
+        <w:ind w:left="4320" w:hanging="360"/>
+      </w:pPr>
+      <w:rPr>
+        <w:rFonts w:ascii="Wingdings" w:hAnsi="Wingdings" w:hint="default"/>
+        <w:sz w:val="20"/>
+      </w:rPr>
+    </w:lvl>
+    <w:lvl w:ilvl="6" w:tentative="1">
+      <w:start w:val="1"/>
+      <w:numFmt w:val="bullet"/>
+      <w:lvlText w:val=""/>
+      <w:lvlJc w:val="left"/>
+      <w:pPr>
+        <w:tabs>
+          <w:tab w:val="num" w:pos="5040"/>
+        </w:tabs>
+        <w:ind w:left="5040" w:hanging="360"/>
+      </w:pPr>
+      <w:rPr>
+        <w:rFonts w:ascii="Wingdings" w:hAnsi="Wingdings" w:hint="default"/>
+        <w:sz w:val="20"/>
+      </w:rPr>
+    </w:lvl>
+    <w:lvl w:ilvl="7" w:tentative="1">
+      <w:start w:val="1"/>
+      <w:numFmt w:val="bullet"/>
+      <w:lvlText w:val=""/>
+      <w:lvlJc w:val="left"/>
+      <w:pPr>
+        <w:tabs>
+          <w:tab w:val="num" w:pos="5760"/>
+        </w:tabs>
+        <w:ind w:left="5760" w:hanging="360"/>
+      </w:pPr>
+      <w:rPr>
+        <w:rFonts w:ascii="Wingdings" w:hAnsi="Wingdings" w:hint="default"/>
+        <w:sz w:val="20"/>
+      </w:rPr>
+    </w:lvl>
+    <w:lvl w:ilvl="8" w:tentative="1">
+      <w:start w:val="1"/>
+      <w:numFmt w:val="bullet"/>
+      <w:lvlText w:val=""/>
+      <w:lvlJc w:val="left"/>
+      <w:pPr>
+        <w:tabs>
+          <w:tab w:val="num" w:pos="6480"/>
+        </w:tabs>
+        <w:ind w:left="6480" w:hanging="360"/>
+      </w:pPr>
+      <w:rPr>
+        <w:rFonts w:ascii="Wingdings" w:hAnsi="Wingdings" w:hint="default"/>
+        <w:sz w:val="20"/>
+      </w:rPr>
+    </w:lvl>
+  </w:abstractNum>
+  <w:abstractNum w:abstractNumId="2" w15:restartNumberingAfterBreak="0">
+    <w:nsid w:val="272E3F2A"/>
+    <w:multiLevelType w:val="multilevel"/>
+    <w:tmpl w:val="BEFC5546"/>
+    <w:lvl w:ilvl="0">
+      <w:start w:val="1"/>
+      <w:numFmt w:val="bullet"/>
+      <w:lvlText w:val=""/>
+      <w:lvlJc w:val="left"/>
+      <w:pPr>
+        <w:tabs>
+          <w:tab w:val="num" w:pos="720"/>
+        </w:tabs>
+        <w:ind w:left="720" w:hanging="360"/>
+      </w:pPr>
+      <w:rPr>
+        <w:rFonts w:ascii="Symbol" w:hAnsi="Symbol" w:hint="default"/>
+        <w:sz w:val="20"/>
+      </w:rPr>
+    </w:lvl>
+    <w:lvl w:ilvl="1" w:tentative="1">
+      <w:start w:val="1"/>
+      <w:numFmt w:val="bullet"/>
+      <w:lvlText w:val="o"/>
+      <w:lvlJc w:val="left"/>
+      <w:pPr>
+        <w:tabs>
+          <w:tab w:val="num" w:pos="1440"/>
+        </w:tabs>
+        <w:ind w:left="1440" w:hanging="360"/>
+      </w:pPr>
+      <w:rPr>
+        <w:rFonts w:ascii="Courier New" w:hAnsi="Courier New" w:hint="default"/>
+        <w:sz w:val="20"/>
+      </w:rPr>
+    </w:lvl>
+    <w:lvl w:ilvl="2" w:tentative="1">
+      <w:start w:val="1"/>
+      <w:numFmt w:val="bullet"/>
+      <w:lvlText w:val=""/>
+      <w:lvlJc w:val="left"/>
+      <w:pPr>
+        <w:tabs>
+          <w:tab w:val="num" w:pos="2160"/>
+        </w:tabs>
+        <w:ind w:left="2160" w:hanging="360"/>
+      </w:pPr>
+      <w:rPr>
+        <w:rFonts w:ascii="Wingdings" w:hAnsi="Wingdings" w:hint="default"/>
+        <w:sz w:val="20"/>
+      </w:rPr>
+    </w:lvl>
+    <w:lvl w:ilvl="3" w:tentative="1">
+      <w:start w:val="1"/>
+      <w:numFmt w:val="bullet"/>
+      <w:lvlText w:val=""/>
+      <w:lvlJc w:val="left"/>
+      <w:pPr>
+        <w:tabs>
+          <w:tab w:val="num" w:pos="2880"/>
+        </w:tabs>
+        <w:ind w:left="2880" w:hanging="360"/>
+      </w:pPr>
+      <w:rPr>
+        <w:rFonts w:ascii="Wingdings" w:hAnsi="Wingdings" w:hint="default"/>
+        <w:sz w:val="20"/>
+      </w:rPr>
+    </w:lvl>
+    <w:lvl w:ilvl="4" w:tentative="1">
+      <w:start w:val="1"/>
+      <w:numFmt w:val="bullet"/>
+      <w:lvlText w:val=""/>
+      <w:lvlJc w:val="left"/>
+      <w:pPr>
+        <w:tabs>
+          <w:tab w:val="num" w:pos="3600"/>
+        </w:tabs>
+        <w:ind w:left="3600" w:hanging="360"/>
+      </w:pPr>
+      <w:rPr>
+        <w:rFonts w:ascii="Wingdings" w:hAnsi="Wingdings" w:hint="default"/>
+        <w:sz w:val="20"/>
+      </w:rPr>
+    </w:lvl>
+    <w:lvl w:ilvl="5" w:tentative="1">
+      <w:start w:val="1"/>
+      <w:numFmt w:val="bullet"/>
+      <w:lvlText w:val=""/>
+      <w:lvlJc w:val="left"/>
+      <w:pPr>
+        <w:tabs>
+          <w:tab w:val="num" w:pos="4320"/>
+        </w:tabs>
+        <w:ind w:left="4320" w:hanging="360"/>
+      </w:pPr>
+      <w:rPr>
+        <w:rFonts w:ascii="Wingdings" w:hAnsi="Wingdings" w:hint="default"/>
+        <w:sz w:val="20"/>
+      </w:rPr>
+    </w:lvl>
+    <w:lvl w:ilvl="6" w:tentative="1">
+      <w:start w:val="1"/>
+      <w:numFmt w:val="bullet"/>
+      <w:lvlText w:val=""/>
+      <w:lvlJc w:val="left"/>
+      <w:pPr>
+        <w:tabs>
+          <w:tab w:val="num" w:pos="5040"/>
+        </w:tabs>
+        <w:ind w:left="5040" w:hanging="360"/>
+      </w:pPr>
+      <w:rPr>
+        <w:rFonts w:ascii="Wingdings" w:hAnsi="Wingdings" w:hint="default"/>
+        <w:sz w:val="20"/>
+      </w:rPr>
+    </w:lvl>
+    <w:lvl w:ilvl="7" w:tentative="1">
+      <w:start w:val="1"/>
+      <w:numFmt w:val="bullet"/>
+      <w:lvlText w:val=""/>
+      <w:lvlJc w:val="left"/>
+      <w:pPr>
+        <w:tabs>
+          <w:tab w:val="num" w:pos="5760"/>
+        </w:tabs>
+        <w:ind w:left="5760" w:hanging="360"/>
+      </w:pPr>
+      <w:rPr>
+        <w:rFonts w:ascii="Wingdings" w:hAnsi="Wingdings" w:hint="default"/>
+        <w:sz w:val="20"/>
+      </w:rPr>
+    </w:lvl>
+    <w:lvl w:ilvl="8" w:tentative="1">
+      <w:start w:val="1"/>
+      <w:numFmt w:val="bullet"/>
+      <w:lvlText w:val=""/>
+      <w:lvlJc w:val="left"/>
+      <w:pPr>
+        <w:tabs>
+          <w:tab w:val="num" w:pos="6480"/>
+        </w:tabs>
+        <w:ind w:left="6480" w:hanging="360"/>
+      </w:pPr>
+      <w:rPr>
+        <w:rFonts w:ascii="Wingdings" w:hAnsi="Wingdings" w:hint="default"/>
+        <w:sz w:val="20"/>
+      </w:rPr>
+    </w:lvl>
+  </w:abstractNum>
+  <w:abstractNum w:abstractNumId="3" w15:restartNumberingAfterBreak="0">
+    <w:nsid w:val="444B288D"/>
+    <w:multiLevelType w:val="multilevel"/>
+    <w:tmpl w:val="D228F80C"/>
+    <w:lvl w:ilvl="0">
+      <w:start w:val="1"/>
+      <w:numFmt w:val="bullet"/>
+      <w:lvlText w:val=""/>
+      <w:lvlJc w:val="left"/>
+      <w:pPr>
+        <w:tabs>
+          <w:tab w:val="num" w:pos="720"/>
+        </w:tabs>
+        <w:ind w:left="720" w:hanging="360"/>
+      </w:pPr>
+      <w:rPr>
+        <w:rFonts w:ascii="Symbol" w:hAnsi="Symbol" w:hint="default"/>
+        <w:sz w:val="20"/>
+      </w:rPr>
+    </w:lvl>
+    <w:lvl w:ilvl="1" w:tentative="1">
+      <w:start w:val="1"/>
+      <w:numFmt w:val="bullet"/>
+      <w:lvlText w:val="o"/>
+      <w:lvlJc w:val="left"/>
+      <w:pPr>
+        <w:tabs>
+          <w:tab w:val="num" w:pos="1440"/>
+        </w:tabs>
+        <w:ind w:left="1440" w:hanging="360"/>
+      </w:pPr>
+      <w:rPr>
+        <w:rFonts w:ascii="Courier New" w:hAnsi="Courier New" w:hint="default"/>
+        <w:sz w:val="20"/>
+      </w:rPr>
+    </w:lvl>
+    <w:lvl w:ilvl="2" w:tentative="1">
+      <w:start w:val="1"/>
+      <w:numFmt w:val="bullet"/>
+      <w:lvlText w:val=""/>
+      <w:lvlJc w:val="left"/>
+      <w:pPr>
+        <w:tabs>
+          <w:tab w:val="num" w:pos="2160"/>
+        </w:tabs>
+        <w:ind w:left="2160" w:hanging="360"/>
+      </w:pPr>
+      <w:rPr>
+        <w:rFonts w:ascii="Wingdings" w:hAnsi="Wingdings" w:hint="default"/>
+        <w:sz w:val="20"/>
+      </w:rPr>
+    </w:lvl>
+    <w:lvl w:ilvl="3" w:tentative="1">
+      <w:start w:val="1"/>
+      <w:numFmt w:val="bullet"/>
+      <w:lvlText w:val=""/>
+      <w:lvlJc w:val="left"/>
+      <w:pPr>
+        <w:tabs>
+          <w:tab w:val="num" w:pos="2880"/>
+        </w:tabs>
+        <w:ind w:left="2880" w:hanging="360"/>
+      </w:pPr>
+      <w:rPr>
+        <w:rFonts w:ascii="Wingdings" w:hAnsi="Wingdings" w:hint="default"/>
+        <w:sz w:val="20"/>
+      </w:rPr>
+    </w:lvl>
+    <w:lvl w:ilvl="4" w:tentative="1">
+      <w:start w:val="1"/>
+      <w:numFmt w:val="bullet"/>
+      <w:lvlText w:val=""/>
+      <w:lvlJc w:val="left"/>
+      <w:pPr>
+        <w:tabs>
+          <w:tab w:val="num" w:pos="3600"/>
+        </w:tabs>
+        <w:ind w:left="3600" w:hanging="360"/>
+      </w:pPr>
+      <w:rPr>
+        <w:rFonts w:ascii="Wingdings" w:hAnsi="Wingdings" w:hint="default"/>
+        <w:sz w:val="20"/>
+      </w:rPr>
+    </w:lvl>
+    <w:lvl w:ilvl="5" w:tentative="1">
+      <w:start w:val="1"/>
+      <w:numFmt w:val="bullet"/>
+      <w:lvlText w:val=""/>
+      <w:lvlJc w:val="left"/>
+      <w:pPr>
+        <w:tabs>
+          <w:tab w:val="num" w:pos="4320"/>
+        </w:tabs>
+        <w:ind w:left="4320" w:hanging="360"/>
+      </w:pPr>
+      <w:rPr>
+        <w:rFonts w:ascii="Wingdings" w:hAnsi="Wingdings" w:hint="default"/>
+        <w:sz w:val="20"/>
+      </w:rPr>
+    </w:lvl>
+    <w:lvl w:ilvl="6" w:tentative="1">
+      <w:start w:val="1"/>
+      <w:numFmt w:val="bullet"/>
+      <w:lvlText w:val=""/>
+      <w:lvlJc w:val="left"/>
+      <w:pPr>
+        <w:tabs>
+          <w:tab w:val="num" w:pos="5040"/>
+        </w:tabs>
+        <w:ind w:left="5040" w:hanging="360"/>
+      </w:pPr>
+      <w:rPr>
+        <w:rFonts w:ascii="Wingdings" w:hAnsi="Wingdings" w:hint="default"/>
+        <w:sz w:val="20"/>
+      </w:rPr>
+    </w:lvl>
+    <w:lvl w:ilvl="7" w:tentative="1">
+      <w:start w:val="1"/>
+      <w:numFmt w:val="bullet"/>
+      <w:lvlText w:val=""/>
+      <w:lvlJc w:val="left"/>
+      <w:pPr>
+        <w:tabs>
+          <w:tab w:val="num" w:pos="5760"/>
+        </w:tabs>
+        <w:ind w:left="5760" w:hanging="360"/>
+      </w:pPr>
+      <w:rPr>
+        <w:rFonts w:ascii="Wingdings" w:hAnsi="Wingdings" w:hint="default"/>
+        <w:sz w:val="20"/>
+      </w:rPr>
+    </w:lvl>
+    <w:lvl w:ilvl="8" w:tentative="1">
+      <w:start w:val="1"/>
+      <w:numFmt w:val="bullet"/>
+      <w:lvlText w:val=""/>
+      <w:lvlJc w:val="left"/>
+      <w:pPr>
+        <w:tabs>
+          <w:tab w:val="num" w:pos="6480"/>
+        </w:tabs>
+        <w:ind w:left="6480" w:hanging="360"/>
+      </w:pPr>
+      <w:rPr>
+        <w:rFonts w:ascii="Wingdings" w:hAnsi="Wingdings" w:hint="default"/>
+        <w:sz w:val="20"/>
+      </w:rPr>
+    </w:lvl>
+  </w:abstractNum>
+  <w:abstractNum w:abstractNumId="4" w15:restartNumberingAfterBreak="0">
     <w:nsid w:val="556F4457"/>
     <w:multiLevelType w:val="multilevel"/>
     <w:tmpl w:val="DEFABD54"/>
@@ -1456,7 +3104,7 @@
       </w:rPr>
     </w:lvl>
   </w:abstractNum>
-  <w:abstractNum w:abstractNumId="2" w15:restartNumberingAfterBreak="0">
+  <w:abstractNum w:abstractNumId="5" w15:restartNumberingAfterBreak="0">
     <w:nsid w:val="692B52E6"/>
     <w:multiLevelType w:val="multilevel"/>
     <w:tmpl w:val="36ACEEEA"/>
@@ -1605,14 +3253,327 @@
       </w:rPr>
     </w:lvl>
   </w:abstractNum>
+  <w:abstractNum w:abstractNumId="6" w15:restartNumberingAfterBreak="0">
+    <w:nsid w:val="76EF0170"/>
+    <w:multiLevelType w:val="multilevel"/>
+    <w:tmpl w:val="A1CA5E6C"/>
+    <w:lvl w:ilvl="0">
+      <w:start w:val="1"/>
+      <w:numFmt w:val="bullet"/>
+      <w:lvlText w:val=""/>
+      <w:lvlJc w:val="left"/>
+      <w:pPr>
+        <w:tabs>
+          <w:tab w:val="num" w:pos="720"/>
+        </w:tabs>
+        <w:ind w:left="720" w:hanging="360"/>
+      </w:pPr>
+      <w:rPr>
+        <w:rFonts w:ascii="Symbol" w:hAnsi="Symbol" w:hint="default"/>
+        <w:sz w:val="20"/>
+      </w:rPr>
+    </w:lvl>
+    <w:lvl w:ilvl="1" w:tentative="1">
+      <w:start w:val="1"/>
+      <w:numFmt w:val="bullet"/>
+      <w:lvlText w:val="o"/>
+      <w:lvlJc w:val="left"/>
+      <w:pPr>
+        <w:tabs>
+          <w:tab w:val="num" w:pos="1440"/>
+        </w:tabs>
+        <w:ind w:left="1440" w:hanging="360"/>
+      </w:pPr>
+      <w:rPr>
+        <w:rFonts w:ascii="Courier New" w:hAnsi="Courier New" w:hint="default"/>
+        <w:sz w:val="20"/>
+      </w:rPr>
+    </w:lvl>
+    <w:lvl w:ilvl="2" w:tentative="1">
+      <w:start w:val="1"/>
+      <w:numFmt w:val="bullet"/>
+      <w:lvlText w:val=""/>
+      <w:lvlJc w:val="left"/>
+      <w:pPr>
+        <w:tabs>
+          <w:tab w:val="num" w:pos="2160"/>
+        </w:tabs>
+        <w:ind w:left="2160" w:hanging="360"/>
+      </w:pPr>
+      <w:rPr>
+        <w:rFonts w:ascii="Wingdings" w:hAnsi="Wingdings" w:hint="default"/>
+        <w:sz w:val="20"/>
+      </w:rPr>
+    </w:lvl>
+    <w:lvl w:ilvl="3" w:tentative="1">
+      <w:start w:val="1"/>
+      <w:numFmt w:val="bullet"/>
+      <w:lvlText w:val=""/>
+      <w:lvlJc w:val="left"/>
+      <w:pPr>
+        <w:tabs>
+          <w:tab w:val="num" w:pos="2880"/>
+        </w:tabs>
+        <w:ind w:left="2880" w:hanging="360"/>
+      </w:pPr>
+      <w:rPr>
+        <w:rFonts w:ascii="Wingdings" w:hAnsi="Wingdings" w:hint="default"/>
+        <w:sz w:val="20"/>
+      </w:rPr>
+    </w:lvl>
+    <w:lvl w:ilvl="4" w:tentative="1">
+      <w:start w:val="1"/>
+      <w:numFmt w:val="bullet"/>
+      <w:lvlText w:val=""/>
+      <w:lvlJc w:val="left"/>
+      <w:pPr>
+        <w:tabs>
+          <w:tab w:val="num" w:pos="3600"/>
+        </w:tabs>
+        <w:ind w:left="3600" w:hanging="360"/>
+      </w:pPr>
+      <w:rPr>
+        <w:rFonts w:ascii="Wingdings" w:hAnsi="Wingdings" w:hint="default"/>
+        <w:sz w:val="20"/>
+      </w:rPr>
+    </w:lvl>
+    <w:lvl w:ilvl="5" w:tentative="1">
+      <w:start w:val="1"/>
+      <w:numFmt w:val="bullet"/>
+      <w:lvlText w:val=""/>
+      <w:lvlJc w:val="left"/>
+      <w:pPr>
+        <w:tabs>
+          <w:tab w:val="num" w:pos="4320"/>
+        </w:tabs>
+        <w:ind w:left="4320" w:hanging="360"/>
+      </w:pPr>
+      <w:rPr>
+        <w:rFonts w:ascii="Wingdings" w:hAnsi="Wingdings" w:hint="default"/>
+        <w:sz w:val="20"/>
+      </w:rPr>
+    </w:lvl>
+    <w:lvl w:ilvl="6" w:tentative="1">
+      <w:start w:val="1"/>
+      <w:numFmt w:val="bullet"/>
+      <w:lvlText w:val=""/>
+      <w:lvlJc w:val="left"/>
+      <w:pPr>
+        <w:tabs>
+          <w:tab w:val="num" w:pos="5040"/>
+        </w:tabs>
+        <w:ind w:left="5040" w:hanging="360"/>
+      </w:pPr>
+      <w:rPr>
+        <w:rFonts w:ascii="Wingdings" w:hAnsi="Wingdings" w:hint="default"/>
+        <w:sz w:val="20"/>
+      </w:rPr>
+    </w:lvl>
+    <w:lvl w:ilvl="7" w:tentative="1">
+      <w:start w:val="1"/>
+      <w:numFmt w:val="bullet"/>
+      <w:lvlText w:val=""/>
+      <w:lvlJc w:val="left"/>
+      <w:pPr>
+        <w:tabs>
+          <w:tab w:val="num" w:pos="5760"/>
+        </w:tabs>
+        <w:ind w:left="5760" w:hanging="360"/>
+      </w:pPr>
+      <w:rPr>
+        <w:rFonts w:ascii="Wingdings" w:hAnsi="Wingdings" w:hint="default"/>
+        <w:sz w:val="20"/>
+      </w:rPr>
+    </w:lvl>
+    <w:lvl w:ilvl="8" w:tentative="1">
+      <w:start w:val="1"/>
+      <w:numFmt w:val="bullet"/>
+      <w:lvlText w:val=""/>
+      <w:lvlJc w:val="left"/>
+      <w:pPr>
+        <w:tabs>
+          <w:tab w:val="num" w:pos="6480"/>
+        </w:tabs>
+        <w:ind w:left="6480" w:hanging="360"/>
+      </w:pPr>
+      <w:rPr>
+        <w:rFonts w:ascii="Wingdings" w:hAnsi="Wingdings" w:hint="default"/>
+        <w:sz w:val="20"/>
+      </w:rPr>
+    </w:lvl>
+  </w:abstractNum>
+  <w:abstractNum w:abstractNumId="7" w15:restartNumberingAfterBreak="0">
+    <w:nsid w:val="77F82E15"/>
+    <w:multiLevelType w:val="multilevel"/>
+    <w:tmpl w:val="23722462"/>
+    <w:lvl w:ilvl="0">
+      <w:start w:val="1"/>
+      <w:numFmt w:val="bullet"/>
+      <w:lvlText w:val=""/>
+      <w:lvlJc w:val="left"/>
+      <w:pPr>
+        <w:tabs>
+          <w:tab w:val="num" w:pos="720"/>
+        </w:tabs>
+        <w:ind w:left="720" w:hanging="360"/>
+      </w:pPr>
+      <w:rPr>
+        <w:rFonts w:ascii="Symbol" w:hAnsi="Symbol" w:hint="default"/>
+        <w:sz w:val="20"/>
+      </w:rPr>
+    </w:lvl>
+    <w:lvl w:ilvl="1" w:tentative="1">
+      <w:start w:val="1"/>
+      <w:numFmt w:val="bullet"/>
+      <w:lvlText w:val="o"/>
+      <w:lvlJc w:val="left"/>
+      <w:pPr>
+        <w:tabs>
+          <w:tab w:val="num" w:pos="1440"/>
+        </w:tabs>
+        <w:ind w:left="1440" w:hanging="360"/>
+      </w:pPr>
+      <w:rPr>
+        <w:rFonts w:ascii="Courier New" w:hAnsi="Courier New" w:hint="default"/>
+        <w:sz w:val="20"/>
+      </w:rPr>
+    </w:lvl>
+    <w:lvl w:ilvl="2" w:tentative="1">
+      <w:start w:val="1"/>
+      <w:numFmt w:val="bullet"/>
+      <w:lvlText w:val=""/>
+      <w:lvlJc w:val="left"/>
+      <w:pPr>
+        <w:tabs>
+          <w:tab w:val="num" w:pos="2160"/>
+        </w:tabs>
+        <w:ind w:left="2160" w:hanging="360"/>
+      </w:pPr>
+      <w:rPr>
+        <w:rFonts w:ascii="Wingdings" w:hAnsi="Wingdings" w:hint="default"/>
+        <w:sz w:val="20"/>
+      </w:rPr>
+    </w:lvl>
+    <w:lvl w:ilvl="3" w:tentative="1">
+      <w:start w:val="1"/>
+      <w:numFmt w:val="bullet"/>
+      <w:lvlText w:val=""/>
+      <w:lvlJc w:val="left"/>
+      <w:pPr>
+        <w:tabs>
+          <w:tab w:val="num" w:pos="2880"/>
+        </w:tabs>
+        <w:ind w:left="2880" w:hanging="360"/>
+      </w:pPr>
+      <w:rPr>
+        <w:rFonts w:ascii="Wingdings" w:hAnsi="Wingdings" w:hint="default"/>
+        <w:sz w:val="20"/>
+      </w:rPr>
+    </w:lvl>
+    <w:lvl w:ilvl="4" w:tentative="1">
+      <w:start w:val="1"/>
+      <w:numFmt w:val="bullet"/>
+      <w:lvlText w:val=""/>
+      <w:lvlJc w:val="left"/>
+      <w:pPr>
+        <w:tabs>
+          <w:tab w:val="num" w:pos="3600"/>
+        </w:tabs>
+        <w:ind w:left="3600" w:hanging="360"/>
+      </w:pPr>
+      <w:rPr>
+        <w:rFonts w:ascii="Wingdings" w:hAnsi="Wingdings" w:hint="default"/>
+        <w:sz w:val="20"/>
+      </w:rPr>
+    </w:lvl>
+    <w:lvl w:ilvl="5" w:tentative="1">
+      <w:start w:val="1"/>
+      <w:numFmt w:val="bullet"/>
+      <w:lvlText w:val=""/>
+      <w:lvlJc w:val="left"/>
+      <w:pPr>
+        <w:tabs>
+          <w:tab w:val="num" w:pos="4320"/>
+        </w:tabs>
+        <w:ind w:left="4320" w:hanging="360"/>
+      </w:pPr>
+      <w:rPr>
+        <w:rFonts w:ascii="Wingdings" w:hAnsi="Wingdings" w:hint="default"/>
+        <w:sz w:val="20"/>
+      </w:rPr>
+    </w:lvl>
+    <w:lvl w:ilvl="6" w:tentative="1">
+      <w:start w:val="1"/>
+      <w:numFmt w:val="bullet"/>
+      <w:lvlText w:val=""/>
+      <w:lvlJc w:val="left"/>
+      <w:pPr>
+        <w:tabs>
+          <w:tab w:val="num" w:pos="5040"/>
+        </w:tabs>
+        <w:ind w:left="5040" w:hanging="360"/>
+      </w:pPr>
+      <w:rPr>
+        <w:rFonts w:ascii="Wingdings" w:hAnsi="Wingdings" w:hint="default"/>
+        <w:sz w:val="20"/>
+      </w:rPr>
+    </w:lvl>
+    <w:lvl w:ilvl="7" w:tentative="1">
+      <w:start w:val="1"/>
+      <w:numFmt w:val="bullet"/>
+      <w:lvlText w:val=""/>
+      <w:lvlJc w:val="left"/>
+      <w:pPr>
+        <w:tabs>
+          <w:tab w:val="num" w:pos="5760"/>
+        </w:tabs>
+        <w:ind w:left="5760" w:hanging="360"/>
+      </w:pPr>
+      <w:rPr>
+        <w:rFonts w:ascii="Wingdings" w:hAnsi="Wingdings" w:hint="default"/>
+        <w:sz w:val="20"/>
+      </w:rPr>
+    </w:lvl>
+    <w:lvl w:ilvl="8" w:tentative="1">
+      <w:start w:val="1"/>
+      <w:numFmt w:val="bullet"/>
+      <w:lvlText w:val=""/>
+      <w:lvlJc w:val="left"/>
+      <w:pPr>
+        <w:tabs>
+          <w:tab w:val="num" w:pos="6480"/>
+        </w:tabs>
+        <w:ind w:left="6480" w:hanging="360"/>
+      </w:pPr>
+      <w:rPr>
+        <w:rFonts w:ascii="Wingdings" w:hAnsi="Wingdings" w:hint="default"/>
+        <w:sz w:val="20"/>
+      </w:rPr>
+    </w:lvl>
+  </w:abstractNum>
   <w:num w:numId="1" w16cid:durableId="537396949">
-    <w:abstractNumId w:val="2"/>
+    <w:abstractNumId w:val="5"/>
   </w:num>
   <w:num w:numId="2" w16cid:durableId="1727678695">
-    <w:abstractNumId w:val="1"/>
+    <w:abstractNumId w:val="4"/>
   </w:num>
   <w:num w:numId="3" w16cid:durableId="1483883780">
     <w:abstractNumId w:val="0"/>
+  </w:num>
+  <w:num w:numId="4" w16cid:durableId="1878658756">
+    <w:abstractNumId w:val="6"/>
+  </w:num>
+  <w:num w:numId="5" w16cid:durableId="2056274148">
+    <w:abstractNumId w:val="2"/>
+  </w:num>
+  <w:num w:numId="6" w16cid:durableId="291403964">
+    <w:abstractNumId w:val="1"/>
+  </w:num>
+  <w:num w:numId="7" w16cid:durableId="1463111978">
+    <w:abstractNumId w:val="3"/>
+  </w:num>
+  <w:num w:numId="8" w16cid:durableId="613514582">
+    <w:abstractNumId w:val="7"/>
   </w:num>
 </w:numbering>
 </file>
@@ -2556,6 +4517,18 @@
       <w:shd w:val="clear" w:color="auto" w:fill="E1DFDD"/>
     </w:rPr>
   </w:style>
+  <w:style w:type="character" w:styleId="FollowedHyperlink">
+    <w:name w:val="FollowedHyperlink"/>
+    <w:basedOn w:val="DefaultParagraphFont"/>
+    <w:uiPriority w:val="99"/>
+    <w:semiHidden/>
+    <w:unhideWhenUsed/>
+    <w:rsid w:val="000148CA"/>
+    <w:rPr>
+      <w:color w:val="96607D" w:themeColor="followedHyperlink"/>
+      <w:u w:val="single"/>
+    </w:rPr>
+  </w:style>
 </w:styles>
 </file>
 

</xml_diff>